<commit_message>
data(HR-02): reword one bullet away from an operations artifact's own vocabulary
The bullet paraphrased a line the interviewed candidate speaks in their own
frozen transcript, and the paraphrase happened to land on a phrase another
frozen artifact's registered feature is described in. The claim is unchanged and
still contradicts nothing that candidate said; only the wording moves, so no
resume can be read as touching a finding that belongs to a different exercise.
DOCX and MANIFEST rebuilt behind it.

Co-Authored-By: Claude Fable 5 <noreply@anthropic.com>
</commit_message>
<xml_diff>
--- a/artifacts/HR-02/build/resume-ca-002.docx
+++ b/artifacts/HR-02/build/resume-ca-002.docx
@@ -152,7 +152,7 @@
         </w:numPr>
       </w:pPr>
       <w:r>
-        <w:t xml:space="preserve">Stopped reporting our own phase and started reporting the customer’s, after sitting in on calls where complete meant a form sent and a fortnight of silence.</w:t>
+        <w:t xml:space="preserve">Stopped reporting our own phase and started reporting the customer’s, after sitting in on calls where complete meant a form sent and then silence.</w:t>
       </w:r>
     </w:p>
     <w:bookmarkEnd w:id="10"/>
@@ -174,7 +174,7 @@
         </w:numPr>
       </w:pPr>
       <w:r>
-        <w:t xml:space="preserve">Ran the intake queue for a delivery group and wrote the first record it had of who had asked for what and when.</w:t>
+        <w:t xml:space="preserve">Ran the intake queue for a delivery group and wrote the first record it had of who asked for what and when.</w:t>
       </w:r>
     </w:p>
     <w:p>
@@ -186,7 +186,7 @@
         </w:numPr>
       </w:pPr>
       <w:r>
-        <w:t xml:space="preserve">Argued for a check that would block a request that had no owner, lost, and kept the warning it became until it caught something expensive.</w:t>
+        <w:t xml:space="preserve">Argued for a check that would block a request until somebody had agreed to take it, lost, and kept the warning it became until it caught something expensive.</w:t>
       </w:r>
     </w:p>
     <w:p>

</xml_diff>